<commit_message>
Full-screen English terminal/dApp screenshots + refreshed report
</commit_message>
<xml_diff>
--- a/Отчет_ПР5_Айкенов.docx
+++ b/Отчет_ПР5_Айкенов.docx
@@ -52,7 +52,7 @@
         <w:br/>
       </w:r>
       <w:r>
-        <w:t>Дата: 20.10.2026</w:t>
+        <w:t>Дата: 21.10.2026</w:t>
       </w:r>
     </w:p>
     <w:p>
@@ -163,7 +163,7 @@
       <w:r>
         <w:drawing>
           <wp:inline xmlns:a="http://schemas.openxmlformats.org/drawingml/2006/main" xmlns:pic="http://schemas.openxmlformats.org/drawingml/2006/picture">
-            <wp:extent cx="5669280" cy="3825525"/>
+            <wp:extent cx="5760720" cy="3887227"/>
             <wp:docPr id="1" name="Picture 1"/>
             <wp:cNvGraphicFramePr>
               <a:graphicFrameLocks noChangeAspect="1"/>
@@ -184,7 +184,7 @@
                   <pic:spPr>
                     <a:xfrm>
                       <a:off x="0" y="0"/>
-                      <a:ext cx="5669280" cy="3825525"/>
+                      <a:ext cx="5760720" cy="3887227"/>
                     </a:xfrm>
                     <a:prstGeom prst="rect"/>
                   </pic:spPr>
@@ -202,6 +202,7 @@
       <w:r>
         <w:rPr>
           <w:i/>
+          <w:color w:val="555555"/>
           <w:sz w:val="18"/>
         </w:rPr>
         <w:t>Рисунок 1. Архитектура и границы доверия</w:t>
@@ -856,6 +857,69 @@
         </w:tc>
       </w:tr>
     </w:tbl>
+    <w:p/>
+    <w:p>
+      <w:r>
+        <w:rPr>
+          <w:b w:val="0"/>
+          <w:i w:val="0"/>
+          <w:sz w:val="22"/>
+        </w:rPr>
+        <w:t>Я развернул контракт на локальном узле, выдал роли оператору и расчётному центру и загрузил три демонстрационных поручения (одно исполнено, одно отклонено, одно оставлено для живой демонстрации):</w:t>
+      </w:r>
+    </w:p>
+    <w:p>
+      <w:pPr>
+        <w:jc w:val="center"/>
+      </w:pPr>
+      <w:r>
+        <w:drawing>
+          <wp:inline xmlns:a="http://schemas.openxmlformats.org/drawingml/2006/main" xmlns:pic="http://schemas.openxmlformats.org/drawingml/2006/picture">
+            <wp:extent cx="5760720" cy="3240405"/>
+            <wp:docPr id="2" name="Picture 2"/>
+            <wp:cNvGraphicFramePr>
+              <a:graphicFrameLocks noChangeAspect="1"/>
+            </wp:cNvGraphicFramePr>
+            <a:graphic>
+              <a:graphicData uri="http://schemas.openxmlformats.org/drawingml/2006/picture">
+                <pic:pic>
+                  <pic:nvPicPr>
+                    <pic:cNvPr id="0" name="03_deploy_seed.png"/>
+                    <pic:cNvPicPr/>
+                  </pic:nvPicPr>
+                  <pic:blipFill>
+                    <a:blip r:embed="rId10"/>
+                    <a:stretch>
+                      <a:fillRect/>
+                    </a:stretch>
+                  </pic:blipFill>
+                  <pic:spPr>
+                    <a:xfrm>
+                      <a:off x="0" y="0"/>
+                      <a:ext cx="5760720" cy="3240405"/>
+                    </a:xfrm>
+                    <a:prstGeom prst="rect"/>
+                  </pic:spPr>
+                </pic:pic>
+              </a:graphicData>
+            </a:graphic>
+          </wp:inline>
+        </w:drawing>
+      </w:r>
+    </w:p>
+    <w:p>
+      <w:pPr>
+        <w:jc w:val="center"/>
+      </w:pPr>
+      <w:r>
+        <w:rPr>
+          <w:i/>
+          <w:color w:val="555555"/>
+          <w:sz w:val="18"/>
+        </w:rPr>
+        <w:t>Рисунок 2. Развёртывание, выдача ролей и демо-данные (деплой на блоке 1)</w:t>
+      </w:r>
+    </w:p>
     <w:p>
       <w:r>
         <w:br w:type="page"/>
@@ -954,7 +1018,7 @@
         <w:drawing>
           <wp:inline xmlns:a="http://schemas.openxmlformats.org/drawingml/2006/main" xmlns:pic="http://schemas.openxmlformats.org/drawingml/2006/picture">
             <wp:extent cx="5760720" cy="3240405"/>
-            <wp:docPr id="2" name="Picture 2"/>
+            <wp:docPr id="3" name="Picture 3"/>
             <wp:cNvGraphicFramePr>
               <a:graphicFrameLocks noChangeAspect="1"/>
             </wp:cNvGraphicFramePr>
@@ -963,68 +1027,6 @@
                 <pic:pic>
                   <pic:nvPicPr>
                     <pic:cNvPr id="0" name="01_dapp_ui.png"/>
-                    <pic:cNvPicPr/>
-                  </pic:nvPicPr>
-                  <pic:blipFill>
-                    <a:blip r:embed="rId10"/>
-                    <a:stretch>
-                      <a:fillRect/>
-                    </a:stretch>
-                  </pic:blipFill>
-                  <pic:spPr>
-                    <a:xfrm>
-                      <a:off x="0" y="0"/>
-                      <a:ext cx="5760720" cy="3240405"/>
-                    </a:xfrm>
-                    <a:prstGeom prst="rect"/>
-                  </pic:spPr>
-                </pic:pic>
-              </a:graphicData>
-            </a:graphic>
-          </wp:inline>
-        </w:drawing>
-      </w:r>
-    </w:p>
-    <w:p>
-      <w:pPr>
-        <w:jc w:val="center"/>
-      </w:pPr>
-      <w:r>
-        <w:rPr>
-          <w:i/>
-          <w:color w:val="555555"/>
-          <w:sz w:val="18"/>
-        </w:rPr>
-        <w:t>Рисунок 2. Интерфейс dApp (локальная сеть chainId 31337)</w:t>
-      </w:r>
-    </w:p>
-    <w:p>
-      <w:r>
-        <w:rPr>
-          <w:b w:val="0"/>
-          <w:i w:val="0"/>
-          <w:sz w:val="22"/>
-        </w:rPr>
-        <w:t>Чтобы быстро проверить интеграцию из терминала, я сделал отдельное окно проверки Задания 1: оно показывает успешные чтения зелёными галочками, а заблокированную попытку несанкционированного доступа — красным (состояние реестра при этом не меняется).</w:t>
-      </w:r>
-    </w:p>
-    <w:p>
-      <w:pPr>
-        <w:jc w:val="center"/>
-      </w:pPr>
-      <w:r>
-        <w:drawing>
-          <wp:inline xmlns:a="http://schemas.openxmlformats.org/drawingml/2006/main" xmlns:pic="http://schemas.openxmlformats.org/drawingml/2006/picture">
-            <wp:extent cx="5760720" cy="3240405"/>
-            <wp:docPr id="3" name="Picture 3"/>
-            <wp:cNvGraphicFramePr>
-              <a:graphicFrameLocks noChangeAspect="1"/>
-            </wp:cNvGraphicFramePr>
-            <a:graphic>
-              <a:graphicData uri="http://schemas.openxmlformats.org/drawingml/2006/picture">
-                <pic:pic>
-                  <pic:nvPicPr>
-                    <pic:cNvPr id="0" name="08_task1_web.png"/>
                     <pic:cNvPicPr/>
                   </pic:nvPicPr>
                   <pic:blipFill>
@@ -1057,7 +1059,121 @@
           <w:color w:val="555555"/>
           <w:sz w:val="18"/>
         </w:rPr>
-        <w:t>Рисунок 3. Терминал Задания 1: проверки (зелёным) и заблокированная атака (красным)</w:t>
+        <w:t>Рисунок 3. Интерфейс dApp: сессия кошелька, машина состояний транзакции, операции чтения/записи</w:t>
+      </w:r>
+    </w:p>
+    <w:p>
+      <w:pPr>
+        <w:jc w:val="center"/>
+      </w:pPr>
+      <w:r>
+        <w:drawing>
+          <wp:inline xmlns:a="http://schemas.openxmlformats.org/drawingml/2006/main" xmlns:pic="http://schemas.openxmlformats.org/drawingml/2006/picture">
+            <wp:extent cx="5760720" cy="3240405"/>
+            <wp:docPr id="4" name="Picture 4"/>
+            <wp:cNvGraphicFramePr>
+              <a:graphicFrameLocks noChangeAspect="1"/>
+            </wp:cNvGraphicFramePr>
+            <a:graphic>
+              <a:graphicData uri="http://schemas.openxmlformats.org/drawingml/2006/picture">
+                <pic:pic>
+                  <pic:nvPicPr>
+                    <pic:cNvPr id="0" name="02_dapp_events.png"/>
+                    <pic:cNvPicPr/>
+                  </pic:nvPicPr>
+                  <pic:blipFill>
+                    <a:blip r:embed="rId12"/>
+                    <a:stretch>
+                      <a:fillRect/>
+                    </a:stretch>
+                  </pic:blipFill>
+                  <pic:spPr>
+                    <a:xfrm>
+                      <a:off x="0" y="0"/>
+                      <a:ext cx="5760720" cy="3240405"/>
+                    </a:xfrm>
+                    <a:prstGeom prst="rect"/>
+                  </pic:spPr>
+                </pic:pic>
+              </a:graphicData>
+            </a:graphic>
+          </wp:inline>
+        </w:drawing>
+      </w:r>
+    </w:p>
+    <w:p>
+      <w:pPr>
+        <w:jc w:val="center"/>
+      </w:pPr>
+      <w:r>
+        <w:rPr>
+          <w:i/>
+          <w:color w:val="555555"/>
+          <w:sz w:val="18"/>
+        </w:rPr>
+        <w:t>Рисунок 4. Лента событий dApp: PaymentRegistered/PaymentStatusChanged без дублей, по убыванию блока</w:t>
+      </w:r>
+    </w:p>
+    <w:p>
+      <w:r>
+        <w:rPr>
+          <w:b w:val="0"/>
+          <w:i w:val="0"/>
+          <w:sz w:val="22"/>
+        </w:rPr>
+        <w:t>Чтобы быстро проверить интеграцию из терминала, я сделал отдельное окно проверки Задания 1: оно показывает успешные чтения зелёными галочками, а заблокированную попытку несанкционированного доступа — красным (состояние реестра при этом не меняется).</w:t>
+      </w:r>
+    </w:p>
+    <w:p>
+      <w:pPr>
+        <w:jc w:val="center"/>
+      </w:pPr>
+      <w:r>
+        <w:drawing>
+          <wp:inline xmlns:a="http://schemas.openxmlformats.org/drawingml/2006/main" xmlns:pic="http://schemas.openxmlformats.org/drawingml/2006/picture">
+            <wp:extent cx="5760720" cy="3240405"/>
+            <wp:docPr id="5" name="Picture 5"/>
+            <wp:cNvGraphicFramePr>
+              <a:graphicFrameLocks noChangeAspect="1"/>
+            </wp:cNvGraphicFramePr>
+            <a:graphic>
+              <a:graphicData uri="http://schemas.openxmlformats.org/drawingml/2006/picture">
+                <pic:pic>
+                  <pic:nvPicPr>
+                    <pic:cNvPr id="0" name="04_task1.png"/>
+                    <pic:cNvPicPr/>
+                  </pic:nvPicPr>
+                  <pic:blipFill>
+                    <a:blip r:embed="rId13"/>
+                    <a:stretch>
+                      <a:fillRect/>
+                    </a:stretch>
+                  </pic:blipFill>
+                  <pic:spPr>
+                    <a:xfrm>
+                      <a:off x="0" y="0"/>
+                      <a:ext cx="5760720" cy="3240405"/>
+                    </a:xfrm>
+                    <a:prstGeom prst="rect"/>
+                  </pic:spPr>
+                </pic:pic>
+              </a:graphicData>
+            </a:graphic>
+          </wp:inline>
+        </w:drawing>
+      </w:r>
+    </w:p>
+    <w:p>
+      <w:pPr>
+        <w:jc w:val="center"/>
+      </w:pPr>
+      <w:r>
+        <w:rPr>
+          <w:i/>
+          <w:color w:val="555555"/>
+          <w:sz w:val="18"/>
+        </w:rPr>
+        <w:t>Рисунок 5. Терминал Задания 1: проверки (зелёным) и заблокированная атака (красным)</w:t>
       </w:r>
     </w:p>
     <w:p>
@@ -1457,7 +1573,7 @@
         <w:drawing>
           <wp:inline xmlns:a="http://schemas.openxmlformats.org/drawingml/2006/main" xmlns:pic="http://schemas.openxmlformats.org/drawingml/2006/picture">
             <wp:extent cx="5760720" cy="3240405"/>
-            <wp:docPr id="4" name="Picture 4"/>
+            <wp:docPr id="6" name="Picture 6"/>
             <wp:cNvGraphicFramePr>
               <a:graphicFrameLocks noChangeAspect="1"/>
             </wp:cNvGraphicFramePr>
@@ -1465,11 +1581,11 @@
               <a:graphicData uri="http://schemas.openxmlformats.org/drawingml/2006/picture">
                 <pic:pic>
                   <pic:nvPicPr>
-                    <pic:cNvPr id="0" name="15_task2_tests.png"/>
+                    <pic:cNvPr id="0" name="05_tests.png"/>
                     <pic:cNvPicPr/>
                   </pic:nvPicPr>
                   <pic:blipFill>
-                    <a:blip r:embed="rId12"/>
+                    <a:blip r:embed="rId14"/>
                     <a:stretch>
                       <a:fillRect/>
                     </a:stretch>
@@ -1498,7 +1614,7 @@
           <w:color w:val="555555"/>
           <w:sz w:val="18"/>
         </w:rPr>
-        <w:t>Рисунок 4. Терминал Задания 2: зелёные тесты и заблокированные уязвимости (красным)</w:t>
+        <w:t>Рисунок 6. Терминал Задания 2: зелёные тесты и заблокированные уязвимости (красным)</w:t>
       </w:r>
     </w:p>
     <w:p>
@@ -1606,16 +1722,6 @@
       </w:r>
     </w:p>
     <w:p>
-      <w:r>
-        <w:rPr>
-          <w:b w:val="0"/>
-          <w:i w:val="0"/>
-          <w:sz w:val="22"/>
-        </w:rPr>
-        <w:t>Демонстрация срабатывания R-1: аккаунт без роли трижды пытается выполнить привилегированную операцию — правило срабатывает один раз, повторные подавляются cooldown-ом.</w:t>
-      </w:r>
-    </w:p>
-    <w:p>
       <w:pPr>
         <w:jc w:val="center"/>
       </w:pPr>
@@ -1623,7 +1729,7 @@
         <w:drawing>
           <wp:inline xmlns:a="http://schemas.openxmlformats.org/drawingml/2006/main" xmlns:pic="http://schemas.openxmlformats.org/drawingml/2006/picture">
             <wp:extent cx="5760720" cy="3240405"/>
-            <wp:docPr id="5" name="Picture 5"/>
+            <wp:docPr id="7" name="Picture 7"/>
             <wp:cNvGraphicFramePr>
               <a:graphicFrameLocks noChangeAspect="1"/>
             </wp:cNvGraphicFramePr>
@@ -1631,11 +1737,11 @@
               <a:graphicData uri="http://schemas.openxmlformats.org/drawingml/2006/picture">
                 <pic:pic>
                   <pic:nvPicPr>
-                    <pic:cNvPr id="0" name="12_alert_R1.png"/>
+                    <pic:cNvPr id="0" name="06_monitor.png"/>
                     <pic:cNvPicPr/>
                   </pic:nvPicPr>
                   <pic:blipFill>
-                    <a:blip r:embed="rId13"/>
+                    <a:blip r:embed="rId15"/>
                     <a:stretch>
                       <a:fillRect/>
                     </a:stretch>
@@ -1664,7 +1770,7 @@
           <w:color w:val="555555"/>
           <w:sz w:val="18"/>
         </w:rPr>
-        <w:t>Рисунок 5. Срабатывание правила R-1 (красный алерт HIGH) и подавление cooldown-ом</w:t>
+        <w:t>Рисунок 7. Сервис мониторинга: телеметрия, правила R-1/R-2 и живой алерт R-1 (красным)</w:t>
       </w:r>
     </w:p>
     <w:p>
@@ -1674,7 +1780,7 @@
           <w:i w:val="0"/>
           <w:sz w:val="22"/>
         </w:rPr>
-        <w:t>Окно проверки Задания 3 показывает срабатывание R-1, штатный сценарий без алертов и сводку нагрузочного эксперимента:</w:t>
+        <w:t>Демонстрация срабатывания R-1: аккаунт без роли трижды пытается выполнить привилегированную операцию — правило срабатывает один раз, повторные подавляются cooldown-ом. Штатный сценарий (регистрация → исполнение → проверка документа) не поднимает ни одного алерта.</w:t>
       </w:r>
     </w:p>
     <w:p>
@@ -1685,7 +1791,7 @@
         <w:drawing>
           <wp:inline xmlns:a="http://schemas.openxmlformats.org/drawingml/2006/main" xmlns:pic="http://schemas.openxmlformats.org/drawingml/2006/picture">
             <wp:extent cx="5760720" cy="3240405"/>
-            <wp:docPr id="6" name="Picture 6"/>
+            <wp:docPr id="8" name="Picture 8"/>
             <wp:cNvGraphicFramePr>
               <a:graphicFrameLocks noChangeAspect="1"/>
             </wp:cNvGraphicFramePr>
@@ -1693,11 +1799,11 @@
               <a:graphicData uri="http://schemas.openxmlformats.org/drawingml/2006/picture">
                 <pic:pic>
                   <pic:nvPicPr>
-                    <pic:cNvPr id="0" name="11_task3_monitor_load.png"/>
+                    <pic:cNvPr id="0" name="07_alert_R1.png"/>
                     <pic:cNvPicPr/>
                   </pic:nvPicPr>
                   <pic:blipFill>
-                    <a:blip r:embed="rId14"/>
+                    <a:blip r:embed="rId16"/>
                     <a:stretch>
                       <a:fillRect/>
                     </a:stretch>
@@ -1726,7 +1832,111 @@
           <w:color w:val="555555"/>
           <w:sz w:val="18"/>
         </w:rPr>
-        <w:t>Рисунок 6. Терминал Задания 3: мониторинг и нагрузка</w:t>
+        <w:t>Рисунок 8. Срабатывание R-1 (красный алерт HIGH) и подавление cooldown-ом</w:t>
+      </w:r>
+    </w:p>
+    <w:p>
+      <w:pPr>
+        <w:jc w:val="center"/>
+      </w:pPr>
+      <w:r>
+        <w:drawing>
+          <wp:inline xmlns:a="http://schemas.openxmlformats.org/drawingml/2006/main" xmlns:pic="http://schemas.openxmlformats.org/drawingml/2006/picture">
+            <wp:extent cx="5760720" cy="3240405"/>
+            <wp:docPr id="9" name="Picture 9"/>
+            <wp:cNvGraphicFramePr>
+              <a:graphicFrameLocks noChangeAspect="1"/>
+            </wp:cNvGraphicFramePr>
+            <a:graphic>
+              <a:graphicData uri="http://schemas.openxmlformats.org/drawingml/2006/picture">
+                <pic:pic>
+                  <pic:nvPicPr>
+                    <pic:cNvPr id="0" name="08_normal.png"/>
+                    <pic:cNvPicPr/>
+                  </pic:nvPicPr>
+                  <pic:blipFill>
+                    <a:blip r:embed="rId17"/>
+                    <a:stretch>
+                      <a:fillRect/>
+                    </a:stretch>
+                  </pic:blipFill>
+                  <pic:spPr>
+                    <a:xfrm>
+                      <a:off x="0" y="0"/>
+                      <a:ext cx="5760720" cy="3240405"/>
+                    </a:xfrm>
+                    <a:prstGeom prst="rect"/>
+                  </pic:spPr>
+                </pic:pic>
+              </a:graphicData>
+            </a:graphic>
+          </wp:inline>
+        </w:drawing>
+      </w:r>
+    </w:p>
+    <w:p>
+      <w:pPr>
+        <w:jc w:val="center"/>
+      </w:pPr>
+      <w:r>
+        <w:rPr>
+          <w:i/>
+          <w:color w:val="555555"/>
+          <w:sz w:val="18"/>
+        </w:rPr>
+        <w:t>Рисунок 9. Штатный сценарий легитимными ролями — «alerts: 0»</w:t>
+      </w:r>
+    </w:p>
+    <w:p>
+      <w:pPr>
+        <w:jc w:val="center"/>
+      </w:pPr>
+      <w:r>
+        <w:drawing>
+          <wp:inline xmlns:a="http://schemas.openxmlformats.org/drawingml/2006/main" xmlns:pic="http://schemas.openxmlformats.org/drawingml/2006/picture">
+            <wp:extent cx="5760720" cy="3240405"/>
+            <wp:docPr id="10" name="Picture 10"/>
+            <wp:cNvGraphicFramePr>
+              <a:graphicFrameLocks noChangeAspect="1"/>
+            </wp:cNvGraphicFramePr>
+            <a:graphic>
+              <a:graphicData uri="http://schemas.openxmlformats.org/drawingml/2006/picture">
+                <pic:pic>
+                  <pic:nvPicPr>
+                    <pic:cNvPr id="0" name="09_task3.png"/>
+                    <pic:cNvPicPr/>
+                  </pic:nvPicPr>
+                  <pic:blipFill>
+                    <a:blip r:embed="rId18"/>
+                    <a:stretch>
+                      <a:fillRect/>
+                    </a:stretch>
+                  </pic:blipFill>
+                  <pic:spPr>
+                    <a:xfrm>
+                      <a:off x="0" y="0"/>
+                      <a:ext cx="5760720" cy="3240405"/>
+                    </a:xfrm>
+                    <a:prstGeom prst="rect"/>
+                  </pic:spPr>
+                </pic:pic>
+              </a:graphicData>
+            </a:graphic>
+          </wp:inline>
+        </w:drawing>
+      </w:r>
+    </w:p>
+    <w:p>
+      <w:pPr>
+        <w:jc w:val="center"/>
+      </w:pPr>
+      <w:r>
+        <w:rPr>
+          <w:i/>
+          <w:color w:val="555555"/>
+          <w:sz w:val="18"/>
+        </w:rPr>
+        <w:t>Рисунок 10. Терминал Задания 3: R-1, штатный сценарий и сводка нагрузки</w:t>
       </w:r>
     </w:p>
     <w:p>
@@ -1736,7 +1946,59 @@
           <w:i w:val="0"/>
           <w:sz w:val="22"/>
         </w:rPr>
-        <w:t>CI-конвейер. Я описал GitHub Actions (.github/workflows/ci.yml): установка зависимостей → компиляция контракта и сборка web → тесты → Slither → аудит зависимостей. Тот же набор проверок я запускаю локально одной командой npm run ci:local (лог — reports/ci/ci-local.log), и он проходит успешно.</w:t>
+        <w:t>CI-конвейер. Я описал GitHub Actions (.github/workflows/ci.yml): установка зависимостей → компиляция контракта и сборка web → тесты → Slither → аудит зависимостей. Тот же набор проверок я запускаю локально одной командой npm run ci:local, и он проходит успешно.</w:t>
+      </w:r>
+    </w:p>
+    <w:p>
+      <w:pPr>
+        <w:jc w:val="center"/>
+      </w:pPr>
+      <w:r>
+        <w:drawing>
+          <wp:inline xmlns:a="http://schemas.openxmlformats.org/drawingml/2006/main" xmlns:pic="http://schemas.openxmlformats.org/drawingml/2006/picture">
+            <wp:extent cx="5760720" cy="3240405"/>
+            <wp:docPr id="11" name="Picture 11"/>
+            <wp:cNvGraphicFramePr>
+              <a:graphicFrameLocks noChangeAspect="1"/>
+            </wp:cNvGraphicFramePr>
+            <a:graphic>
+              <a:graphicData uri="http://schemas.openxmlformats.org/drawingml/2006/picture">
+                <pic:pic>
+                  <pic:nvPicPr>
+                    <pic:cNvPr id="0" name="10_ci_local.png"/>
+                    <pic:cNvPicPr/>
+                  </pic:nvPicPr>
+                  <pic:blipFill>
+                    <a:blip r:embed="rId19"/>
+                    <a:stretch>
+                      <a:fillRect/>
+                    </a:stretch>
+                  </pic:blipFill>
+                  <pic:spPr>
+                    <a:xfrm>
+                      <a:off x="0" y="0"/>
+                      <a:ext cx="5760720" cy="3240405"/>
+                    </a:xfrm>
+                    <a:prstGeom prst="rect"/>
+                  </pic:spPr>
+                </pic:pic>
+              </a:graphicData>
+            </a:graphic>
+          </wp:inline>
+        </w:drawing>
+      </w:r>
+    </w:p>
+    <w:p>
+      <w:pPr>
+        <w:jc w:val="center"/>
+      </w:pPr>
+      <w:r>
+        <w:rPr>
+          <w:i/>
+          <w:color w:val="555555"/>
+          <w:sz w:val="18"/>
+        </w:rPr>
+        <w:t>Рисунок 11. Локальный CI-конвейер (npm run ci:local) — все шаги пройдены</w:t>
       </w:r>
     </w:p>
     <w:p>
@@ -2137,7 +2399,7 @@
         <w:drawing>
           <wp:inline xmlns:a="http://schemas.openxmlformats.org/drawingml/2006/main" xmlns:pic="http://schemas.openxmlformats.org/drawingml/2006/picture">
             <wp:extent cx="4754880" cy="2665615"/>
-            <wp:docPr id="7" name="Picture 7"/>
+            <wp:docPr id="12" name="Picture 12"/>
             <wp:cNvGraphicFramePr>
               <a:graphicFrameLocks noChangeAspect="1"/>
             </wp:cNvGraphicFramePr>
@@ -2149,7 +2411,7 @@
                     <pic:cNvPicPr/>
                   </pic:nvPicPr>
                   <pic:blipFill>
-                    <a:blip r:embed="rId15"/>
+                    <a:blip r:embed="rId20"/>
                     <a:stretch>
                       <a:fillRect/>
                     </a:stretch>
@@ -2178,7 +2440,7 @@
           <w:color w:val="555555"/>
           <w:sz w:val="18"/>
         </w:rPr>
-        <w:t>Рисунок 7. Задержка p50/p95 по профилям</w:t>
+        <w:t>Рисунок 12. Задержка p50/p95 по профилям</w:t>
       </w:r>
     </w:p>
     <w:p>
@@ -2189,7 +2451,7 @@
         <w:drawing>
           <wp:inline xmlns:a="http://schemas.openxmlformats.org/drawingml/2006/main" xmlns:pic="http://schemas.openxmlformats.org/drawingml/2006/picture">
             <wp:extent cx="4754880" cy="2665615"/>
-            <wp:docPr id="8" name="Picture 8"/>
+            <wp:docPr id="13" name="Picture 13"/>
             <wp:cNvGraphicFramePr>
               <a:graphicFrameLocks noChangeAspect="1"/>
             </wp:cNvGraphicFramePr>
@@ -2201,7 +2463,7 @@
                     <pic:cNvPicPr/>
                   </pic:nvPicPr>
                   <pic:blipFill>
-                    <a:blip r:embed="rId16"/>
+                    <a:blip r:embed="rId21"/>
                     <a:stretch>
                       <a:fillRect/>
                     </a:stretch>
@@ -2230,7 +2492,7 @@
           <w:color w:val="555555"/>
           <w:sz w:val="18"/>
         </w:rPr>
-        <w:t>Рисунок 8. Распределение задержек по транзакциям</w:t>
+        <w:t>Рисунок 13. Распределение задержек по транзакциям</w:t>
       </w:r>
     </w:p>
     <w:p>
@@ -2241,7 +2503,7 @@
         <w:drawing>
           <wp:inline xmlns:a="http://schemas.openxmlformats.org/drawingml/2006/main" xmlns:pic="http://schemas.openxmlformats.org/drawingml/2006/picture">
             <wp:extent cx="4754880" cy="2665615"/>
-            <wp:docPr id="9" name="Picture 9"/>
+            <wp:docPr id="14" name="Picture 14"/>
             <wp:cNvGraphicFramePr>
               <a:graphicFrameLocks noChangeAspect="1"/>
             </wp:cNvGraphicFramePr>
@@ -2253,7 +2515,7 @@
                     <pic:cNvPicPr/>
                   </pic:nvPicPr>
                   <pic:blipFill>
-                    <a:blip r:embed="rId17"/>
+                    <a:blip r:embed="rId22"/>
                     <a:stretch>
                       <a:fillRect/>
                     </a:stretch>
@@ -2282,7 +2544,7 @@
           <w:color w:val="555555"/>
           <w:sz w:val="18"/>
         </w:rPr>
-        <w:t>Рисунок 9. gasUsed на registerPayment</w:t>
+        <w:t>Рисунок 14. gasUsed на registerPayment</w:t>
       </w:r>
     </w:p>
     <w:p>
@@ -2512,7 +2774,7 @@
           <w:i w:val="0"/>
           <w:sz w:val="22"/>
         </w:rPr>
-        <w:t>Артефакты запусков собраны в папке reports/ (tests, slither, deps, monitoring, load, ci, screenshots), сводные факты — в REPORT_DATA.md.</w:t>
+        <w:t>Артефакты запусков собраны в папке reports/ (tests, slither, deps, monitoring, load, screenshots), сводные факты — в REPORT_DATA.md.</w:t>
       </w:r>
     </w:p>
     <w:sectPr>

</xml_diff>